<commit_message>
feat: Round 5-14 完整迭代开发
- 后端: AI网关/审计日志/权限控制/层级管理/日志分析/Top10聚合/密码重置
- Android: MBTI测试/AI地图/日志详情/任务派发/人员关系/离线同步/设置页
- 修复6个bug: Top10第null位/MBTI失败重置/审计日志字段null/部门显示1.0/设置Toast/AI超时
- 代码变更: 新增296文件/修改119文件/删除23文件
</commit_message>
<xml_diff>
--- a/docx/docx_generate/产品需求与设计文档.docx
+++ b/docx/docx_generate/产品需求与设计文档.docx
@@ -6207,7 +6207,7 @@
         <w:rPr>
           <w:rFonts w:ascii="黑体" w:hAnsi="黑体" w:eastAsia="黑体"/>
         </w:rPr>
-        <w:t>Epic-6：主题与界面</w:t>
+        <w:t>Epic-6：界面</w:t>
       </w:r>
     </w:p>
     <w:tbl>
@@ -6518,15 +6518,6 @@
           <w:sz w:val="24"/>
         </w:rPr>
         <w:t>7.3.2 十大工作编辑：用户可编辑三类十大工作（公司重要/公司派发/个人重要），按排序序号1-10展示</w:t>
-      </w:r>
-    </w:p>
-    <w:p>
-      <w:r>
-        <w:rPr>
-          <w:rFonts w:ascii="宋体" w:hAnsi="宋体" w:eastAsia="宋体"/>
-          <w:sz w:val="24"/>
-        </w:rPr>
-        <w:t>7.3.3 晨星冒烟测试：每日首次进入日志页时执行轻量级完整性校验，验证数据完整性</w:t>
       </w:r>
     </w:p>
     <w:p>

</xml_diff>